<commit_message>
Tieu luan Triet hoc
</commit_message>
<xml_diff>
--- a/triet-hoc/tieu-luan/Tieu-luan_Nhat-Nguyen.docx
+++ b/triet-hoc/tieu-luan/Tieu-luan_Nhat-Nguyen.docx
@@ -295,7 +295,6 @@
                 <w:b/>
                 <w:sz w:val="28"/>
                 <w:szCs w:val="32"/>
-                <w:lang w:val="en-US"/>
               </w:rPr>
               <w:t xml:space="preserve">Vận dụng nguyên lý về sự phát triển để phân tích mô hình kết hợp giữa </w:t>
             </w:r>
@@ -304,7 +303,6 @@
                 <w:b/>
                 <w:sz w:val="28"/>
                 <w:szCs w:val="32"/>
-                <w:lang w:val="en-US"/>
               </w:rPr>
               <w:t>“</w:t>
             </w:r>
@@ -313,7 +311,6 @@
                 <w:b/>
                 <w:sz w:val="28"/>
                 <w:szCs w:val="32"/>
-                <w:lang w:val="en-US"/>
               </w:rPr>
               <w:t>Y học cổ truyền - Y học hiện đại - Y học số</w:t>
             </w:r>
@@ -322,7 +319,6 @@
                 <w:b/>
                 <w:sz w:val="28"/>
                 <w:szCs w:val="32"/>
-                <w:lang w:val="en-US"/>
               </w:rPr>
               <w:t>”</w:t>
             </w:r>
@@ -331,18 +327,8 @@
                 <w:b/>
                 <w:sz w:val="28"/>
                 <w:szCs w:val="32"/>
-                <w:lang w:val="en-US"/>
-              </w:rPr>
-              <w:t xml:space="preserve"> nhằm tạo dựng bản sắc y tế Việt Nam theo Nghị quyết số 72-NQ/TW của Bộ Chính trị năm 2025</w:t>
-            </w:r>
-            <w:r>
-              <w:rPr>
-                <w:b/>
-                <w:sz w:val="28"/>
-                <w:szCs w:val="32"/>
-                <w:lang w:val="en-US"/>
-              </w:rPr>
-              <w:t>.</w:t>
+              </w:rPr>
+              <w:t xml:space="preserve"> nhằm tạo dựng bản sắc y tế Việt Nam theo Nghị quyết số 72-NQ/TW của Bộ Chính trị năm 2025.</w:t>
             </w:r>
           </w:p>
         </w:tc>
@@ -619,6 +605,7 @@
                       <w:bCs/>
                       <w:sz w:val="30"/>
                       <w:szCs w:val="30"/>
+                      <w:lang w:val="vi-VN"/>
                     </w:rPr>
                   </w:pPr>
                   <w:r>
@@ -657,6 +644,7 @@
                       <w:bCs/>
                       <w:sz w:val="30"/>
                       <w:szCs w:val="30"/>
+                      <w:lang w:val="vi-VN"/>
                     </w:rPr>
                     <w:t>1</w:t>
                   </w:r>
@@ -748,7 +736,6 @@
               <w:rPr>
                 <w:sz w:val="28"/>
                 <w:szCs w:val="28"/>
-                <w:lang w:val="en-US"/>
               </w:rPr>
             </w:pPr>
           </w:p>
@@ -770,7 +757,6 @@
               <w:rPr>
                 <w:sz w:val="28"/>
                 <w:szCs w:val="28"/>
-                <w:lang w:val="en-US"/>
               </w:rPr>
             </w:pPr>
           </w:p>
@@ -792,7 +778,6 @@
               <w:rPr>
                 <w:sz w:val="28"/>
                 <w:szCs w:val="28"/>
-                <w:lang w:val="en-US"/>
               </w:rPr>
             </w:pPr>
           </w:p>
@@ -1178,7 +1163,6 @@
                 <w:b/>
                 <w:sz w:val="28"/>
                 <w:szCs w:val="32"/>
-                <w:lang w:val="en-US"/>
               </w:rPr>
               <w:t xml:space="preserve">Vận dụng nguyên lý về sự phát triển để phân tích mô hình kết hợp giữa </w:t>
             </w:r>
@@ -1187,7 +1171,6 @@
                 <w:b/>
                 <w:sz w:val="28"/>
                 <w:szCs w:val="32"/>
-                <w:lang w:val="en-US"/>
               </w:rPr>
               <w:t>“</w:t>
             </w:r>
@@ -1196,7 +1179,6 @@
                 <w:b/>
                 <w:sz w:val="28"/>
                 <w:szCs w:val="32"/>
-                <w:lang w:val="en-US"/>
               </w:rPr>
               <w:t>Y học cổ truyền - Y học hiện đại - Y học số</w:t>
             </w:r>
@@ -1205,7 +1187,6 @@
                 <w:b/>
                 <w:sz w:val="28"/>
                 <w:szCs w:val="32"/>
-                <w:lang w:val="en-US"/>
               </w:rPr>
               <w:t>”</w:t>
             </w:r>
@@ -1214,18 +1195,8 @@
                 <w:b/>
                 <w:sz w:val="28"/>
                 <w:szCs w:val="32"/>
-                <w:lang w:val="en-US"/>
-              </w:rPr>
-              <w:t xml:space="preserve"> nhằm tạo dựng bản sắc y tế Việt Nam theo Nghị quyết số 72-NQ/TW của Bộ Chính trị năm 2025</w:t>
-            </w:r>
-            <w:r>
-              <w:rPr>
-                <w:b/>
-                <w:sz w:val="28"/>
-                <w:szCs w:val="32"/>
-                <w:lang w:val="en-US"/>
-              </w:rPr>
-              <w:t>.</w:t>
+              </w:rPr>
+              <w:t xml:space="preserve"> nhằm tạo dựng bản sắc y tế Việt Nam theo Nghị quyết số 72-NQ/TW của Bộ Chính trị năm 2025.</w:t>
             </w:r>
           </w:p>
         </w:tc>
@@ -1492,6 +1463,7 @@
                       <w:bCs/>
                       <w:sz w:val="30"/>
                       <w:szCs w:val="30"/>
+                      <w:lang w:val="vi-VN"/>
                     </w:rPr>
                   </w:pPr>
                   <w:r>
@@ -1502,36 +1474,7 @@
                       <w:szCs w:val="30"/>
                       <w:lang w:val="vi-VN"/>
                     </w:rPr>
-                    <w:t xml:space="preserve">Bác sĩ chuyên khoa 1 </w:t>
-                  </w:r>
-                  <w:r>
-                    <w:rPr>
-                      <w:b/>
-                      <w:bCs/>
-                      <w:sz w:val="30"/>
-                      <w:szCs w:val="30"/>
-                      <w:lang w:val="vi-VN"/>
-                    </w:rPr>
-                    <w:t>–</w:t>
-                  </w:r>
-                  <w:r>
-                    <w:rPr>
-                      <w:b/>
-                      <w:bCs/>
-                      <w:sz w:val="30"/>
-                      <w:szCs w:val="30"/>
-                      <w:lang w:val="vi-VN"/>
-                    </w:rPr>
-                    <w:t xml:space="preserve"> 3</w:t>
-                  </w:r>
-                  <w:r>
-                    <w:rPr>
-                      <w:b/>
-                      <w:bCs/>
-                      <w:sz w:val="30"/>
-                      <w:szCs w:val="30"/>
-                    </w:rPr>
-                    <w:t>1</w:t>
+                    <w:t>Bác sĩ chuyên khoa 1 – 31</w:t>
                   </w:r>
                 </w:p>
               </w:tc>
@@ -1621,7 +1564,6 @@
               <w:rPr>
                 <w:sz w:val="28"/>
                 <w:szCs w:val="28"/>
-                <w:lang w:val="en-US"/>
               </w:rPr>
             </w:pPr>
           </w:p>
@@ -1643,7 +1585,6 @@
               <w:rPr>
                 <w:sz w:val="28"/>
                 <w:szCs w:val="28"/>
-                <w:lang w:val="en-US"/>
               </w:rPr>
             </w:pPr>
           </w:p>
@@ -1665,7 +1606,6 @@
               <w:rPr>
                 <w:sz w:val="28"/>
                 <w:szCs w:val="28"/>
-                <w:lang w:val="en-US"/>
               </w:rPr>
             </w:pPr>
           </w:p>
@@ -1764,7 +1704,6 @@
         <w:rPr>
           <w:b/>
           <w:bCs/>
-          <w:lang w:val="en-US"/>
         </w:rPr>
       </w:pPr>
     </w:p>
@@ -1787,25 +1726,10 @@
         <w:t>Mục lục</w:t>
       </w:r>
     </w:p>
+    <w:p/>
+    <w:p/>
     <w:p>
       <w:pPr>
-        <w:rPr>
-          <w:lang w:val="en-US"/>
-        </w:rPr>
-      </w:pPr>
-    </w:p>
-    <w:p>
-      <w:pPr>
-        <w:rPr>
-          <w:lang w:val="en-US"/>
-        </w:rPr>
-      </w:pPr>
-    </w:p>
-    <w:p>
-      <w:pPr>
-        <w:rPr>
-          <w:lang w:val="en-US"/>
-        </w:rPr>
         <w:sectPr>
           <w:footerReference w:type="default" r:id="rId8"/>
           <w:pgSz w:w="11909" w:h="16834" w:code="9"/>
@@ -1824,18 +1748,9 @@
         <w:t>Mở đầu</w:t>
       </w:r>
     </w:p>
+    <w:p/>
     <w:p>
       <w:pPr>
-        <w:rPr>
-          <w:lang w:val="en-US"/>
-        </w:rPr>
-      </w:pPr>
-    </w:p>
-    <w:p>
-      <w:pPr>
-        <w:rPr>
-          <w:lang w:val="en-US"/>
-        </w:rPr>
         <w:sectPr>
           <w:footerReference w:type="default" r:id="rId9"/>
           <w:pgSz w:w="11909" w:h="16834" w:code="9"/>
@@ -1849,29 +1764,14 @@
     <w:p>
       <w:pPr>
         <w:pStyle w:val="Heading1"/>
-        <w:rPr>
-          <w:lang w:val="en-US"/>
-        </w:rPr>
       </w:pPr>
       <w:r>
         <w:lastRenderedPageBreak/>
         <w:t>Nội dung</w:t>
       </w:r>
     </w:p>
-    <w:p>
-      <w:pPr>
-        <w:rPr>
-          <w:lang w:val="en-US"/>
-        </w:rPr>
-      </w:pPr>
-    </w:p>
-    <w:p>
-      <w:pPr>
-        <w:rPr>
-          <w:lang w:val="en-US"/>
-        </w:rPr>
-      </w:pPr>
-    </w:p>
+    <w:p/>
+    <w:p/>
     <w:p>
       <w:pPr>
         <w:pStyle w:val="Heading1"/>
@@ -1886,9 +1786,6 @@
     <w:p>
       <w:pPr>
         <w:pStyle w:val="Heading1"/>
-        <w:rPr>
-          <w:lang w:val="en-US"/>
-        </w:rPr>
       </w:pPr>
       <w:r>
         <w:lastRenderedPageBreak/>
@@ -1937,9 +1834,6 @@
     <w:pPr>
       <w:pStyle w:val="Footer"/>
       <w:jc w:val="center"/>
-      <w:rPr>
-        <w:lang w:val="en-US"/>
-      </w:rPr>
     </w:pPr>
   </w:p>
   <w:p>
@@ -2418,6 +2312,7 @@
     </w:pPr>
     <w:rPr>
       <w:rFonts w:ascii="Times New Roman" w:hAnsi="Times New Roman"/>
+      <w:noProof/>
       <w:kern w:val="0"/>
       <w:sz w:val="32"/>
       <w:szCs w:val="24"/>
@@ -2620,6 +2515,7 @@
   <w:style w:type="character" w:default="1" w:styleId="DefaultParagraphFont">
     <w:name w:val="Default Paragraph Font"/>
     <w:uiPriority w:val="1"/>
+    <w:semiHidden/>
     <w:unhideWhenUsed/>
   </w:style>
   <w:style w:type="table" w:default="1" w:styleId="TableNormal">

</xml_diff>